<commit_message>
Update configuration and add new feature files for finetuning results
</commit_message>
<xml_diff>
--- a/outputs/reports/project_report.docx
+++ b/outputs/reports/project_report.docx
@@ -991,54 +991,10 @@
     </w:p>
     <w:p>
       <w:pPr>
-        <w:jc w:val="center"/>
+        <w:spacing w:after="80"/>
       </w:pPr>
       <w:r>
-        <w:drawing>
-          <wp:inline xmlns:a="http://schemas.openxmlformats.org/drawingml/2006/main" xmlns:pic="http://schemas.openxmlformats.org/drawingml/2006/picture">
-            <wp:extent cx="5940000" cy="9296676"/>
-            <wp:docPr id="1" name="Picture 1"/>
-            <wp:cNvGraphicFramePr>
-              <a:graphicFrameLocks noChangeAspect="1"/>
-            </wp:cNvGraphicFramePr>
-            <a:graphic>
-              <a:graphicData uri="http://schemas.openxmlformats.org/drawingml/2006/picture">
-                <pic:pic>
-                  <pic:nvPicPr>
-                    <pic:cNvPr id="0" name="architecture.jpg"/>
-                    <pic:cNvPicPr/>
-                  </pic:nvPicPr>
-                  <pic:blipFill>
-                    <a:blip r:embed="rId9"/>
-                    <a:stretch>
-                      <a:fillRect/>
-                    </a:stretch>
-                  </pic:blipFill>
-                  <pic:spPr>
-                    <a:xfrm>
-                      <a:off x="0" y="0"/>
-                      <a:ext cx="5940000" cy="9296676"/>
-                    </a:xfrm>
-                    <a:prstGeom prst="rect"/>
-                  </pic:spPr>
-                </pic:pic>
-              </a:graphicData>
-            </a:graphic>
-          </wp:inline>
-        </w:drawing>
-      </w:r>
-    </w:p>
-    <w:p>
-      <w:pPr>
-        <w:spacing w:after="160"/>
-        <w:jc w:val="center"/>
-      </w:pPr>
-      <w:r>
-        <w:rPr>
-          <w:i/>
-          <w:sz w:val="17"/>
-        </w:rPr>
-        <w:t>Figure 1: Full architecture — Image Input → Augmentation → MobileNetV2 (154 layers) → GAP (1280-dim) → Fine-tune → Re-extract → XGBoost → LangGraph Inference</w:t>
+        <w:t>[Figure not found: architecture.jpg — export the .drawio file as JPG first]</w:t>
       </w:r>
     </w:p>
     <w:p>
@@ -1059,54 +1015,10 @@
     </w:p>
     <w:p>
       <w:pPr>
-        <w:jc w:val="center"/>
+        <w:spacing w:after="80"/>
       </w:pPr>
       <w:r>
-        <w:drawing>
-          <wp:inline xmlns:a="http://schemas.openxmlformats.org/drawingml/2006/main" xmlns:pic="http://schemas.openxmlformats.org/drawingml/2006/picture">
-            <wp:extent cx="5400000" cy="6314023"/>
-            <wp:docPr id="2" name="Picture 2"/>
-            <wp:cNvGraphicFramePr>
-              <a:graphicFrameLocks noChangeAspect="1"/>
-            </wp:cNvGraphicFramePr>
-            <a:graphic>
-              <a:graphicData uri="http://schemas.openxmlformats.org/drawingml/2006/picture">
-                <pic:pic>
-                  <pic:nvPicPr>
-                    <pic:cNvPr id="0" name="data_flow.jpg"/>
-                    <pic:cNvPicPr/>
-                  </pic:nvPicPr>
-                  <pic:blipFill>
-                    <a:blip r:embed="rId10"/>
-                    <a:stretch>
-                      <a:fillRect/>
-                    </a:stretch>
-                  </pic:blipFill>
-                  <pic:spPr>
-                    <a:xfrm>
-                      <a:off x="0" y="0"/>
-                      <a:ext cx="5400000" cy="6314023"/>
-                    </a:xfrm>
-                    <a:prstGeom prst="rect"/>
-                  </pic:spPr>
-                </pic:pic>
-              </a:graphicData>
-            </a:graphic>
-          </wp:inline>
-        </w:drawing>
-      </w:r>
-    </w:p>
-    <w:p>
-      <w:pPr>
-        <w:spacing w:after="160"/>
-        <w:jc w:val="center"/>
-      </w:pPr>
-      <w:r>
-        <w:rPr>
-          <w:i/>
-          <w:sz w:val="17"/>
-        </w:rPr>
-        <w:t>Figure 2: Data flow — showing the role of Train, Val, and Test splits at each pipeline stage</w:t>
+        <w:t>[Figure not found: data_flow.jpg — export the .drawio file as JPG first]</w:t>
       </w:r>
     </w:p>
     <w:p>
@@ -2204,7 +2116,7 @@
               <w:rPr>
                 <w:sz w:val="17"/>
               </w:rPr>
-              <w:t>98.84%</w:t>
+              <w:t>99.06%</w:t>
             </w:r>
           </w:p>
         </w:tc>
@@ -2217,7 +2129,7 @@
               <w:rPr>
                 <w:sz w:val="17"/>
               </w:rPr>
-              <w:t>0.9856</w:t>
+              <w:t>0.9900</w:t>
             </w:r>
           </w:p>
         </w:tc>
@@ -2230,7 +2142,7 @@
               <w:rPr>
                 <w:sz w:val="17"/>
               </w:rPr>
-              <w:t>0.9884</w:t>
+              <w:t>0.9906</w:t>
             </w:r>
           </w:p>
         </w:tc>
@@ -2243,7 +2155,7 @@
               <w:rPr>
                 <w:sz w:val="17"/>
               </w:rPr>
-              <w:t>99.97%</w:t>
+              <w:t>99.90%</w:t>
             </w:r>
           </w:p>
         </w:tc>
@@ -2384,7 +2296,7 @@
               <w:rPr>
                 <w:sz w:val="16"/>
               </w:rPr>
-              <w:t>0.99</w:t>
+              <w:t>1.00</w:t>
             </w:r>
           </w:p>
         </w:tc>
@@ -2439,7 +2351,7 @@
               <w:rPr>
                 <w:sz w:val="16"/>
               </w:rPr>
-              <w:t>0.99</w:t>
+              <w:t>1.00</w:t>
             </w:r>
           </w:p>
         </w:tc>
@@ -2575,7 +2487,7 @@
               <w:rPr>
                 <w:sz w:val="16"/>
               </w:rPr>
-              <w:t>1.00</w:t>
+              <w:t>0.99</w:t>
             </w:r>
           </w:p>
         </w:tc>
@@ -2602,7 +2514,7 @@
               <w:rPr>
                 <w:sz w:val="16"/>
               </w:rPr>
-              <w:t>1.00</w:t>
+              <w:t>0.99</w:t>
             </w:r>
           </w:p>
         </w:tc>
@@ -2656,7 +2568,7 @@
               <w:rPr>
                 <w:sz w:val="16"/>
               </w:rPr>
-              <w:t>0.96</w:t>
+              <w:t>1.00</w:t>
             </w:r>
           </w:p>
         </w:tc>
@@ -2670,7 +2582,7 @@
               <w:rPr>
                 <w:sz w:val="16"/>
               </w:rPr>
-              <w:t>0.98</w:t>
+              <w:t>1.00</w:t>
             </w:r>
           </w:p>
         </w:tc>
@@ -2724,7 +2636,7 @@
               <w:rPr>
                 <w:sz w:val="16"/>
               </w:rPr>
-              <w:t>0.99</w:t>
+              <w:t>0.98</w:t>
             </w:r>
           </w:p>
         </w:tc>
@@ -2779,7 +2691,7 @@
               <w:rPr>
                 <w:sz w:val="16"/>
               </w:rPr>
-              <w:t>0.94</w:t>
+              <w:t>0.97</w:t>
             </w:r>
           </w:p>
         </w:tc>
@@ -2792,21 +2704,21 @@
               <w:rPr>
                 <w:sz w:val="16"/>
               </w:rPr>
-              <w:t>0.93</w:t>
+              <w:t>0.97</w:t>
             </w:r>
           </w:p>
         </w:tc>
         <w:tc>
           <w:tcPr>
             <w:tcW w:type="dxa" w:w="1994"/>
-            <w:shd w:fill="FFFFFF" w:val="clear"/>
+            <w:shd w:fill="E0FFE0" w:val="clear"/>
           </w:tcPr>
           <w:p>
             <w:r>
               <w:rPr>
                 <w:sz w:val="16"/>
               </w:rPr>
-              <w:t>0.94</w:t>
+              <w:t>0.97</w:t>
             </w:r>
           </w:p>
         </w:tc>
@@ -2915,7 +2827,7 @@
               <w:rPr>
                 <w:sz w:val="16"/>
               </w:rPr>
-              <w:t>0.99</w:t>
+              <w:t>0.98</w:t>
             </w:r>
           </w:p>
         </w:tc>
@@ -2928,7 +2840,7 @@
               <w:rPr>
                 <w:sz w:val="16"/>
               </w:rPr>
-              <w:t>0.94</w:t>
+              <w:t>0.98</w:t>
             </w:r>
           </w:p>
         </w:tc>
@@ -2942,7 +2854,7 @@
               <w:rPr>
                 <w:sz w:val="16"/>
               </w:rPr>
-              <w:t>0.97</w:t>
+              <w:t>0.98</w:t>
             </w:r>
           </w:p>
         </w:tc>
@@ -2983,7 +2895,7 @@
               <w:rPr>
                 <w:sz w:val="16"/>
               </w:rPr>
-              <w:t>0.99</w:t>
+              <w:t>0.97</w:t>
             </w:r>
           </w:p>
         </w:tc>
@@ -2996,7 +2908,7 @@
               <w:rPr>
                 <w:sz w:val="16"/>
               </w:rPr>
-              <w:t>0.99</w:t>
+              <w:t>1.00</w:t>
             </w:r>
           </w:p>
         </w:tc>
@@ -3051,7 +2963,7 @@
               <w:rPr>
                 <w:sz w:val="16"/>
               </w:rPr>
-              <w:t>0.99</w:t>
+              <w:t>0.98</w:t>
             </w:r>
           </w:p>
         </w:tc>
@@ -3119,7 +3031,7 @@
               <w:rPr>
                 <w:sz w:val="16"/>
               </w:rPr>
-              <w:t>0.97</w:t>
+              <w:t>0.99</w:t>
             </w:r>
           </w:p>
         </w:tc>
@@ -3146,7 +3058,7 @@
               <w:rPr>
                 <w:sz w:val="16"/>
               </w:rPr>
-              <w:t>0.98</w:t>
+              <w:t>0.99</w:t>
             </w:r>
           </w:p>
         </w:tc>
@@ -3382,7 +3294,7 @@
         <w:spacing w:after="60"/>
       </w:pPr>
       <w:r>
-        <w:t>The fine-tuned MobileNetV2 model achieved 98.84% accuracy and 0.9856 macro F1 on the 3,097 held-out test images, with top-3 accuracy of 99.97%. This represents a dramatic improvement over the frozen baseline (73.81% accuracy, 0.7125 macro F1). Fine-tuning layers 100-153 on plant disease images allowed the backbone to learn agricultural-specific textures — lesion boundaries, mould patterns, discolouration gradients — that generic ImageNet features could not capture. Previously problematic classes (Tomato_Bacterial_spot F1=0.36, Tomato_Early_blight F1=0.27) now achieve near-perfect scores, demonstrating that the frozen catch-all absorber problem has been resolved by domain adaptation. The LangGraph confidence router correctly flags the rare low-confidence predictions (below 60%) rather than silently returning an unreliable diagnosis.</w:t>
+        <w:t>The fine-tuned MobileNetV2 model achieved 99.06% accuracy and 0.9900 macro F1 on the 3,097 held-out test images, with top-3 accuracy of 99.90%. This represents a dramatic improvement over the frozen baseline (73.81% accuracy, 0.7125 macro F1). Fine-tuning layers 100-153 on plant disease images allowed the backbone to learn agricultural-specific textures — lesion boundaries, mould patterns, discolouration gradients — that generic ImageNet features could not capture. Previously problematic classes (Tomato_Bacterial_spot F1=0.36, Tomato_Early_blight F1=0.27) now achieve near-perfect scores, demonstrating that the frozen catch-all absorber problem has been resolved by domain adaptation. The LangGraph confidence router correctly flags the rare low-confidence predictions (below 60%) rather than silently returning an unreliable diagnosis.</w:t>
       </w:r>
     </w:p>
     <w:p>
@@ -3503,7 +3415,7 @@
               <w:rPr>
                 <w:sz w:val="17"/>
               </w:rPr>
-              <w:t>98.84%</w:t>
+              <w:t>99.06%</w:t>
             </w:r>
           </w:p>
         </w:tc>
@@ -3516,7 +3428,7 @@
               <w:rPr>
                 <w:sz w:val="17"/>
               </w:rPr>
-              <w:t>+25.03%</w:t>
+              <w:t>+25.25%</w:t>
             </w:r>
           </w:p>
         </w:tc>
@@ -3557,7 +3469,7 @@
               <w:rPr>
                 <w:sz w:val="17"/>
               </w:rPr>
-              <w:t>0.9856</w:t>
+              <w:t>0.9900</w:t>
             </w:r>
           </w:p>
         </w:tc>
@@ -3570,7 +3482,7 @@
               <w:rPr>
                 <w:sz w:val="17"/>
               </w:rPr>
-              <w:t>+0.2731</w:t>
+              <w:t>+0.2775</w:t>
             </w:r>
           </w:p>
         </w:tc>
@@ -3611,7 +3523,7 @@
               <w:rPr>
                 <w:sz w:val="17"/>
               </w:rPr>
-              <w:t>0.9884</w:t>
+              <w:t>0.9906</w:t>
             </w:r>
           </w:p>
         </w:tc>
@@ -3624,7 +3536,7 @@
               <w:rPr>
                 <w:sz w:val="17"/>
               </w:rPr>
-              <w:t>+0.2643</w:t>
+              <w:t>+0.2665</w:t>
             </w:r>
           </w:p>
         </w:tc>
@@ -3665,7 +3577,7 @@
               <w:rPr>
                 <w:sz w:val="17"/>
               </w:rPr>
-              <w:t>99.97%</w:t>
+              <w:t>99.90%</w:t>
             </w:r>
           </w:p>
         </w:tc>
@@ -3678,7 +3590,7 @@
               <w:rPr>
                 <w:sz w:val="17"/>
               </w:rPr>
-              <w:t>+6.78%</w:t>
+              <w:t>+6.71%</w:t>
             </w:r>
           </w:p>
         </w:tc>
@@ -3945,7 +3857,7 @@
         <w:spacing w:after="80"/>
       </w:pPr>
       <w:r>
-        <w:t>This project demonstrates that a fine-tuned MobileNetV2 + XGBoost pipeline achieves 98.84% accuracy and 0.9856 macro F1 on 15 crop disease classes, with top-3 accuracy of 99.97% — suitable for farmer-facing deployment. The sequential modular pipeline (fine-tune -&gt; re-extract -&gt; XGBoost -&gt; LangGraph) allows each stage to be improved independently. The auto-updating config ensures each Optuna run builds on the previous best, making the system self-improving over successive runs.</w:t>
+        <w:t>This project demonstrates that a fine-tuned MobileNetV2 + XGBoost pipeline achieves 99.06% accuracy and 0.9900 macro F1 on 15 crop disease classes, with top-3 accuracy of 99.90% — suitable for farmer-facing deployment. The sequential modular pipeline (fine-tune -&gt; re-extract -&gt; XGBoost -&gt; LangGraph) allows each stage to be improved independently. The auto-updating config ensures each Optuna run builds on the previous best, making the system self-improving over successive runs.</w:t>
       </w:r>
     </w:p>
     <w:p>
@@ -4017,7 +3929,7 @@
       </w:r>
     </w:p>
     <w:sectPr>
-      <w:footerReference w:type="default" r:id="rId11"/>
+      <w:footerReference w:type="default" r:id="rId9"/>
       <w:pgSz w:w="12240" w:h="15840"/>
       <w:pgMar w:top="1020" w:right="1134" w:bottom="1020" w:left="1134" w:header="720" w:footer="720" w:gutter="0"/>
       <w:cols w:space="720"/>

</xml_diff>